<commit_message>
Practiced making my own resume
</commit_message>
<xml_diff>
--- a/tests/my_resume/test2.docx
+++ b/tests/my_resume/test2.docx
@@ -228,7 +228,7 @@
                   <a:graphicData uri="http://schemas.microsoft.com/office/word/2010/wordprocessingShape">
                     <wps:wsp>
                       <wps:cNvSpPr/>
-                      <wps:cNvPr id="8" name="Shape 8"/>
+                      <wps:cNvPr id="6" name="Shape 6"/>
                       <wps:spPr>
                         <a:xfrm>
                           <a:off x="2028760" y="3779365"/>
@@ -280,12 +280,12 @@
                 <wp:extent cx="6634480" cy="28575"/>
                 <wp:effectExtent b="0" l="0" r="0" t="0"/>
                 <wp:wrapTopAndBottom distB="0" distT="0"/>
-                <wp:docPr id="4" name="image5.png"/>
+                <wp:docPr id="4" name="image4.png"/>
                 <a:graphic>
                   <a:graphicData uri="http://schemas.openxmlformats.org/drawingml/2006/picture">
                     <pic:pic>
                       <pic:nvPicPr>
-                        <pic:cNvPr id="0" name="image5.png"/>
+                        <pic:cNvPr id="0" name="image4.png"/>
                         <pic:cNvPicPr preferRelativeResize="0"/>
                       </pic:nvPicPr>
                       <pic:blipFill>
@@ -454,12 +454,12 @@
               <wp:inline distB="0" distT="0" distL="0" distR="0">
                 <wp:extent cx="6653530" cy="9525"/>
                 <wp:effectExtent b="0" l="0" r="0" t="0"/>
-                <wp:docPr id="1" name="image2.png"/>
+                <wp:docPr id="1" name="image1.png"/>
                 <a:graphic>
                   <a:graphicData uri="http://schemas.openxmlformats.org/drawingml/2006/picture">
                     <pic:pic>
                       <pic:nvPicPr>
-                        <pic:cNvPr id="0" name="image2.png"/>
+                        <pic:cNvPr id="0" name="image1.png"/>
                         <pic:cNvPicPr preferRelativeResize="0"/>
                       </pic:nvPicPr>
                       <pic:blipFill>
@@ -581,7 +581,7 @@
                   <a:graphicData uri="http://schemas.microsoft.com/office/word/2010/wordprocessingShape">
                     <wps:wsp>
                       <wps:cNvSpPr/>
-                      <wps:cNvPr id="9" name="Shape 9"/>
+                      <wps:cNvPr id="7" name="Shape 7"/>
                       <wps:spPr>
                         <a:xfrm>
                           <a:off x="2019235" y="3779365"/>
@@ -633,12 +633,12 @@
                 <wp:extent cx="6653530" cy="12700"/>
                 <wp:effectExtent b="0" l="0" r="0" t="0"/>
                 <wp:wrapTopAndBottom distB="0" distT="0"/>
-                <wp:docPr id="5" name="image6.png"/>
+                <wp:docPr id="5" name="image5.png"/>
                 <a:graphic>
                   <a:graphicData uri="http://schemas.openxmlformats.org/drawingml/2006/picture">
                     <pic:pic>
                       <pic:nvPicPr>
-                        <pic:cNvPr id="0" name="image6.png"/>
+                        <pic:cNvPr id="0" name="image5.png"/>
                         <pic:cNvPicPr preferRelativeResize="0"/>
                       </pic:nvPicPr>
                       <pic:blipFill>
@@ -839,12 +839,12 @@
                 <wp:extent cx="6653530" cy="12700"/>
                 <wp:effectExtent b="0" l="0" r="0" t="0"/>
                 <wp:wrapTopAndBottom distB="0" distT="0"/>
-                <wp:docPr id="2" name="image3.png"/>
+                <wp:docPr id="2" name="image2.png"/>
                 <a:graphic>
                   <a:graphicData uri="http://schemas.openxmlformats.org/drawingml/2006/picture">
                     <pic:pic>
                       <pic:nvPicPr>
-                        <pic:cNvPr id="0" name="image3.png"/>
+                        <pic:cNvPr id="0" name="image2.png"/>
                         <pic:cNvPicPr preferRelativeResize="0"/>
                       </pic:nvPicPr>
                       <pic:blipFill>
@@ -914,7 +914,7 @@
       <w:pPr>
         <w:numPr>
           <w:ilvl w:val="0"/>
-          <w:numId w:val="3"/>
+          <w:numId w:val="4"/>
         </w:numPr>
         <w:spacing w:before="113" w:line="309.6" w:lineRule="auto"/>
         <w:ind w:left="720" w:hanging="360"/>
@@ -955,36 +955,18 @@
     </w:p>
     <w:p>
       <w:pPr>
-        <w:rPr/>
-      </w:pPr>
-      <w:r>
-        <w:rPr>
-          <w:rtl w:val="0"/>
-        </w:rPr>
-      </w:r>
-    </w:p>
-    <w:p>
-      <w:pPr>
-        <w:rPr/>
-      </w:pPr>
-      <w:r>
-        <w:rPr>
-          <w:rtl w:val="0"/>
-        </w:rPr>
-      </w:r>
-    </w:p>
-    <w:p>
-      <w:pPr>
         <w:pStyle w:val="Heading1"/>
-        <w:spacing w:before="111" w:lineRule="auto"/>
-        <w:ind w:left="171" w:firstLine="0"/>
-        <w:rPr/>
-      </w:pPr>
-      <w:r>
-        <w:rPr>
-          <w:rtl w:val="0"/>
-        </w:rPr>
-        <w:t xml:space="preserve">CERTIFICATES</w:t>
+        <w:spacing w:before="179" w:lineRule="auto"/>
+        <w:ind w:left="143" w:firstLine="0"/>
+        <w:rPr/>
+      </w:pPr>
+      <w:bookmarkStart w:colFirst="0" w:colLast="0" w:name="_ny3jo5gga7sg" w:id="0"/>
+      <w:bookmarkEnd w:id="0"/>
+      <w:r>
+        <w:rPr>
+          <w:rtl w:val="0"/>
+        </w:rPr>
+        <w:t xml:space="preserve">CERTIFICATIONS</w:t>
       </w:r>
       <w:r>
         <mc:AlternateContent>
@@ -993,10 +975,10 @@
               <wp:anchor allowOverlap="1" behindDoc="0" distB="0" distT="0" distL="0" distR="0" hidden="0" layoutInCell="1" locked="0" relativeHeight="0" simplePos="0">
                 <wp:simplePos x="0" y="0"/>
                 <wp:positionH relativeFrom="column">
-                  <wp:posOffset>113610</wp:posOffset>
+                  <wp:posOffset>95945</wp:posOffset>
                 </wp:positionH>
                 <wp:positionV relativeFrom="paragraph">
-                  <wp:posOffset>280059</wp:posOffset>
+                  <wp:posOffset>323034</wp:posOffset>
                 </wp:positionV>
                 <wp:extent cx="6653530" cy="12700"/>
                 <wp:effectExtent b="0" l="0" r="0" t="0"/>
@@ -1006,7 +988,7 @@
                   <a:graphicData uri="http://schemas.microsoft.com/office/word/2010/wordprocessingShape">
                     <wps:wsp>
                       <wps:cNvSpPr/>
-                      <wps:cNvPr id="10" name="Shape 10"/>
+                      <wps:cNvPr id="5" name="Shape 5"/>
                       <wps:spPr>
                         <a:xfrm>
                           <a:off x="2019235" y="3779365"/>
@@ -1050,20 +1032,20 @@
               <wp:anchor allowOverlap="1" behindDoc="0" distB="0" distT="0" distL="0" distR="0" hidden="0" layoutInCell="1" locked="0" relativeHeight="0" simplePos="0">
                 <wp:simplePos x="0" y="0"/>
                 <wp:positionH relativeFrom="column">
-                  <wp:posOffset>113610</wp:posOffset>
+                  <wp:posOffset>95945</wp:posOffset>
                 </wp:positionH>
                 <wp:positionV relativeFrom="paragraph">
-                  <wp:posOffset>280059</wp:posOffset>
+                  <wp:posOffset>323034</wp:posOffset>
                 </wp:positionV>
                 <wp:extent cx="6653530" cy="12700"/>
                 <wp:effectExtent b="0" l="0" r="0" t="0"/>
                 <wp:wrapTopAndBottom distB="0" distT="0"/>
-                <wp:docPr id="6" name="image7.png"/>
+                <wp:docPr id="6" name="image6.png"/>
                 <a:graphic>
                   <a:graphicData uri="http://schemas.openxmlformats.org/drawingml/2006/picture">
                     <pic:pic>
                       <pic:nvPicPr>
-                        <pic:cNvPr id="0" name="image7.png"/>
+                        <pic:cNvPr id="0" name="image6.png"/>
                         <pic:cNvPicPr preferRelativeResize="0"/>
                       </pic:nvPicPr>
                       <pic:blipFill>
@@ -1092,348 +1074,66 @@
     </w:p>
     <w:p>
       <w:pPr>
-        <w:keepNext w:val="0"/>
-        <w:keepLines w:val="0"/>
-        <w:pageBreakBefore w:val="0"/>
-        <w:widowControl w:val="0"/>
-        <w:pBdr>
-          <w:top w:space="0" w:sz="0" w:val="nil"/>
-          <w:left w:space="0" w:sz="0" w:val="nil"/>
-          <w:bottom w:space="0" w:sz="0" w:val="nil"/>
-          <w:right w:space="0" w:sz="0" w:val="nil"/>
-          <w:between w:space="0" w:sz="0" w:val="nil"/>
-        </w:pBdr>
-        <w:shd w:fill="auto" w:val="clear"/>
-        <w:spacing w:after="0" w:before="7" w:line="240" w:lineRule="auto"/>
-        <w:ind w:left="0" w:right="0" w:firstLine="0"/>
-        <w:jc w:val="left"/>
-        <w:rPr>
-          <w:rFonts w:ascii="Trebuchet MS" w:cs="Trebuchet MS" w:eastAsia="Trebuchet MS" w:hAnsi="Trebuchet MS"/>
+        <w:spacing w:before="113" w:line="240" w:lineRule="auto"/>
+        <w:rPr/>
+      </w:pPr>
+      <w:r>
+        <w:rPr>
+          <w:rtl w:val="0"/>
+        </w:rPr>
+        <w:t xml:space="preserve">{% for cert in certifications %}</w:t>
+      </w:r>
+    </w:p>
+    <w:p>
+      <w:pPr>
+        <w:numPr>
+          <w:ilvl w:val="0"/>
+          <w:numId w:val="3"/>
+        </w:numPr>
+        <w:spacing w:line="309.6" w:lineRule="auto"/>
+        <w:ind w:left="720" w:hanging="360"/>
+        <w:rPr>
           <w:b w:val="1"/>
-          <w:i w:val="0"/>
-          <w:smallCaps w:val="0"/>
-          <w:strike w:val="0"/>
-          <w:color w:val="000000"/>
-          <w:sz w:val="8"/>
-          <w:szCs w:val="8"/>
-          <w:u w:val="none"/>
-          <w:shd w:fill="auto" w:val="clear"/>
-          <w:vertAlign w:val="baseline"/>
-        </w:rPr>
-        <w:sectPr>
-          <w:pgSz w:h="16850" w:w="11910" w:orient="portrait"/>
-          <w:pgMar w:bottom="280" w:top="180" w:left="566" w:right="566" w:header="360" w:footer="360"/>
-          <w:pgNumType w:start="1"/>
-        </w:sectPr>
-      </w:pPr>
-      <w:r>
-        <w:rPr>
-          <w:rtl w:val="0"/>
-        </w:rPr>
-      </w:r>
-    </w:p>
-    <w:p>
-      <w:pPr>
-        <w:spacing w:before="93" w:lineRule="auto"/>
-        <w:ind w:left="273" w:right="0" w:firstLine="0"/>
-        <w:jc w:val="left"/>
-        <w:rPr>
-          <w:rFonts w:ascii="Tahoma" w:cs="Tahoma" w:eastAsia="Tahoma" w:hAnsi="Tahoma"/>
+        </w:rPr>
+      </w:pPr>
+      <w:r>
+        <w:rPr>
           <w:b w:val="1"/>
-          <w:sz w:val="22"/>
-          <w:szCs w:val="22"/>
-        </w:rPr>
-      </w:pPr>
-      <w:r>
-        <w:rPr>
-          <w:vertAlign w:val="baseline"/>
-        </w:rPr>
-        <w:drawing>
-          <wp:inline distB="0" distT="0" distL="0" distR="0">
-            <wp:extent cx="38114" cy="38114"/>
-            <wp:effectExtent b="0" l="0" r="0" t="0"/>
-            <wp:docPr id="7" name="image1.png"/>
-            <a:graphic>
-              <a:graphicData uri="http://schemas.openxmlformats.org/drawingml/2006/picture">
-                <pic:pic>
-                  <pic:nvPicPr>
-                    <pic:cNvPr id="0" name="image1.png"/>
-                    <pic:cNvPicPr preferRelativeResize="0"/>
-                  </pic:nvPicPr>
-                  <pic:blipFill>
-                    <a:blip r:embed="rId7"/>
-                    <a:srcRect b="0" l="0" r="0" t="0"/>
-                    <a:stretch>
-                      <a:fillRect/>
-                    </a:stretch>
-                  </pic:blipFill>
-                  <pic:spPr>
-                    <a:xfrm>
-                      <a:off x="0" y="0"/>
-                      <a:ext cx="38114" cy="38114"/>
-                    </a:xfrm>
-                    <a:prstGeom prst="rect"/>
-                    <a:ln/>
-                  </pic:spPr>
-                </pic:pic>
-              </a:graphicData>
-            </a:graphic>
-          </wp:inline>
-        </w:drawing>
-      </w:r>
-      <w:r>
-        <w:rPr>
-          <w:rFonts w:ascii="Times New Roman" w:cs="Times New Roman" w:eastAsia="Times New Roman" w:hAnsi="Times New Roman"/>
-          <w:sz w:val="20"/>
-          <w:szCs w:val="20"/>
-          <w:rtl w:val="0"/>
-        </w:rPr>
-        <w:t xml:space="preserve">  </w:t>
-      </w:r>
-      <w:r>
-        <w:rPr>
-          <w:rFonts w:ascii="Tahoma" w:cs="Tahoma" w:eastAsia="Tahoma" w:hAnsi="Tahoma"/>
-          <w:b w:val="1"/>
-          <w:sz w:val="22"/>
-          <w:szCs w:val="22"/>
-          <w:rtl w:val="0"/>
-        </w:rPr>
-        <w:t xml:space="preserve">Oracle Cloud Infrastructure 2025 Certified Generative AI Professional | </w:t>
-      </w:r>
-      <w:hyperlink r:id="rId8">
-        <w:r>
-          <w:rPr>
-            <w:rFonts w:ascii="Tahoma" w:cs="Tahoma" w:eastAsia="Tahoma" w:hAnsi="Tahoma"/>
-            <w:b w:val="1"/>
-            <w:sz w:val="22"/>
-            <w:szCs w:val="22"/>
-            <w:u w:val="single"/>
-            <w:rtl w:val="0"/>
-          </w:rPr>
-          <w:t xml:space="preserve">LINK</w:t>
-        </w:r>
-      </w:hyperlink>
-      <w:r>
-        <w:rPr>
-          <w:rtl w:val="0"/>
-        </w:rPr>
-      </w:r>
-    </w:p>
-    <w:p>
-      <w:pPr>
-        <w:keepNext w:val="0"/>
-        <w:keepLines w:val="0"/>
-        <w:pageBreakBefore w:val="0"/>
-        <w:widowControl w:val="0"/>
-        <w:pBdr>
-          <w:top w:space="0" w:sz="0" w:val="nil"/>
-          <w:left w:space="0" w:sz="0" w:val="nil"/>
-          <w:bottom w:space="0" w:sz="0" w:val="nil"/>
-          <w:right w:space="0" w:sz="0" w:val="nil"/>
-          <w:between w:space="0" w:sz="0" w:val="nil"/>
-        </w:pBdr>
-        <w:shd w:fill="auto" w:val="clear"/>
-        <w:spacing w:after="0" w:before="103" w:line="240" w:lineRule="auto"/>
-        <w:ind w:left="631" w:right="0" w:firstLine="0"/>
-        <w:jc w:val="left"/>
-        <w:rPr>
-          <w:rFonts w:ascii="Trebuchet MS" w:cs="Trebuchet MS" w:eastAsia="Trebuchet MS" w:hAnsi="Trebuchet MS"/>
-          <w:b w:val="0"/>
-          <w:i w:val="0"/>
-          <w:smallCaps w:val="0"/>
-          <w:strike w:val="0"/>
-          <w:color w:val="000000"/>
-          <w:sz w:val="22"/>
-          <w:szCs w:val="22"/>
-          <w:u w:val="none"/>
-          <w:shd w:fill="auto" w:val="clear"/>
-          <w:vertAlign w:val="baseline"/>
-        </w:rPr>
-      </w:pPr>
-      <w:r>
-        <w:rPr>
-          <w:rFonts w:ascii="Trebuchet MS" w:cs="Trebuchet MS" w:eastAsia="Trebuchet MS" w:hAnsi="Trebuchet MS"/>
-          <w:b w:val="0"/>
-          <w:i w:val="0"/>
-          <w:smallCaps w:val="0"/>
-          <w:strike w:val="0"/>
-          <w:color w:val="000000"/>
-          <w:sz w:val="22"/>
-          <w:szCs w:val="22"/>
-          <w:u w:val="none"/>
-          <w:shd w:fill="auto" w:val="clear"/>
-          <w:vertAlign w:val="baseline"/>
-          <w:rtl w:val="0"/>
-        </w:rPr>
-        <w:t xml:space="preserve">Learned about LangChain, Vector Databases, Semantic Search, OCI GenAI.</w:t>
-      </w:r>
-    </w:p>
-    <w:p>
-      <w:pPr>
-        <w:spacing w:before="212" w:lineRule="auto"/>
-        <w:ind w:left="273" w:right="0" w:firstLine="0"/>
-        <w:jc w:val="left"/>
-        <w:rPr>
-          <w:rFonts w:ascii="Tahoma" w:cs="Tahoma" w:eastAsia="Tahoma" w:hAnsi="Tahoma"/>
-          <w:b w:val="1"/>
-          <w:sz w:val="22"/>
-          <w:szCs w:val="22"/>
-        </w:rPr>
-      </w:pPr>
-      <w:r>
-        <w:rPr>
-          <w:vertAlign w:val="baseline"/>
-        </w:rPr>
-        <w:drawing>
-          <wp:inline distB="0" distT="0" distL="0" distR="0">
-            <wp:extent cx="38114" cy="38114"/>
-            <wp:effectExtent b="0" l="0" r="0" t="0"/>
-            <wp:docPr id="8" name="image1.png"/>
-            <a:graphic>
-              <a:graphicData uri="http://schemas.openxmlformats.org/drawingml/2006/picture">
-                <pic:pic>
-                  <pic:nvPicPr>
-                    <pic:cNvPr id="0" name="image1.png"/>
-                    <pic:cNvPicPr preferRelativeResize="0"/>
-                  </pic:nvPicPr>
-                  <pic:blipFill>
-                    <a:blip r:embed="rId7"/>
-                    <a:srcRect b="0" l="0" r="0" t="0"/>
-                    <a:stretch>
-                      <a:fillRect/>
-                    </a:stretch>
-                  </pic:blipFill>
-                  <pic:spPr>
-                    <a:xfrm>
-                      <a:off x="0" y="0"/>
-                      <a:ext cx="38114" cy="38114"/>
-                    </a:xfrm>
-                    <a:prstGeom prst="rect"/>
-                    <a:ln/>
-                  </pic:spPr>
-                </pic:pic>
-              </a:graphicData>
-            </a:graphic>
-          </wp:inline>
-        </w:drawing>
-      </w:r>
-      <w:r>
-        <w:rPr>
-          <w:rFonts w:ascii="Times New Roman" w:cs="Times New Roman" w:eastAsia="Times New Roman" w:hAnsi="Times New Roman"/>
-          <w:sz w:val="20"/>
-          <w:szCs w:val="20"/>
-          <w:rtl w:val="0"/>
-        </w:rPr>
-        <w:t xml:space="preserve">  </w:t>
-      </w:r>
-      <w:r>
-        <w:rPr>
-          <w:rFonts w:ascii="Tahoma" w:cs="Tahoma" w:eastAsia="Tahoma" w:hAnsi="Tahoma"/>
-          <w:b w:val="1"/>
-          <w:sz w:val="22"/>
-          <w:szCs w:val="22"/>
-          <w:rtl w:val="0"/>
-        </w:rPr>
-        <w:t xml:space="preserve">Oracle Cloud Infrastructure 2025 Certified AI Foundations Associate | </w:t>
-      </w:r>
-      <w:hyperlink r:id="rId9">
-        <w:r>
-          <w:rPr>
-            <w:rFonts w:ascii="Tahoma" w:cs="Tahoma" w:eastAsia="Tahoma" w:hAnsi="Tahoma"/>
-            <w:b w:val="1"/>
-            <w:sz w:val="22"/>
-            <w:szCs w:val="22"/>
-            <w:u w:val="single"/>
-            <w:rtl w:val="0"/>
-          </w:rPr>
-          <w:t xml:space="preserve">LINK</w:t>
-        </w:r>
-      </w:hyperlink>
-      <w:r>
-        <w:rPr>
-          <w:rtl w:val="0"/>
-        </w:rPr>
-      </w:r>
-    </w:p>
-    <w:p>
-      <w:pPr>
-        <w:keepNext w:val="0"/>
-        <w:keepLines w:val="0"/>
-        <w:pageBreakBefore w:val="0"/>
-        <w:widowControl w:val="0"/>
-        <w:pBdr>
-          <w:top w:space="0" w:sz="0" w:val="nil"/>
-          <w:left w:space="0" w:sz="0" w:val="nil"/>
-          <w:bottom w:space="0" w:sz="0" w:val="nil"/>
-          <w:right w:space="0" w:sz="0" w:val="nil"/>
-          <w:between w:space="0" w:sz="0" w:val="nil"/>
-        </w:pBdr>
-        <w:shd w:fill="auto" w:val="clear"/>
-        <w:spacing w:after="0" w:before="103" w:line="240" w:lineRule="auto"/>
-        <w:ind w:left="564" w:right="0" w:firstLine="0"/>
-        <w:jc w:val="left"/>
-        <w:rPr>
-          <w:rFonts w:ascii="Trebuchet MS" w:cs="Trebuchet MS" w:eastAsia="Trebuchet MS" w:hAnsi="Trebuchet MS"/>
-          <w:b w:val="0"/>
-          <w:i w:val="0"/>
-          <w:smallCaps w:val="0"/>
-          <w:strike w:val="0"/>
-          <w:color w:val="000000"/>
-          <w:sz w:val="22"/>
-          <w:szCs w:val="22"/>
-          <w:u w:val="none"/>
-          <w:shd w:fill="auto" w:val="clear"/>
-          <w:vertAlign w:val="baseline"/>
-        </w:rPr>
-      </w:pPr>
-      <w:r>
-        <w:rPr>
-          <w:rFonts w:ascii="Trebuchet MS" w:cs="Trebuchet MS" w:eastAsia="Trebuchet MS" w:hAnsi="Trebuchet MS"/>
-          <w:b w:val="0"/>
-          <w:i w:val="0"/>
-          <w:smallCaps w:val="0"/>
-          <w:strike w:val="0"/>
-          <w:color w:val="000000"/>
-          <w:sz w:val="22"/>
-          <w:szCs w:val="22"/>
-          <w:u w:val="none"/>
-          <w:shd w:fill="auto" w:val="clear"/>
-          <w:vertAlign w:val="baseline"/>
-          <w:rtl w:val="0"/>
-        </w:rPr>
-        <w:t xml:space="preserve">Gained knowledge of AI/ML fundamentals and OCI AI &amp; ML Services.</w:t>
-      </w:r>
-    </w:p>
-    <w:p>
-      <w:pPr>
-        <w:keepNext w:val="0"/>
-        <w:keepLines w:val="0"/>
-        <w:pageBreakBefore w:val="0"/>
-        <w:widowControl w:val="0"/>
-        <w:pBdr>
-          <w:top w:space="0" w:sz="0" w:val="nil"/>
-          <w:left w:space="0" w:sz="0" w:val="nil"/>
-          <w:bottom w:space="0" w:sz="0" w:val="nil"/>
-          <w:right w:space="0" w:sz="0" w:val="nil"/>
-          <w:between w:space="0" w:sz="0" w:val="nil"/>
-        </w:pBdr>
-        <w:shd w:fill="auto" w:val="clear"/>
-        <w:spacing w:after="0" w:before="10" w:line="240" w:lineRule="auto"/>
-        <w:ind w:left="0" w:right="0" w:firstLine="0"/>
-        <w:jc w:val="left"/>
-        <w:rPr>
-          <w:rFonts w:ascii="Trebuchet MS" w:cs="Trebuchet MS" w:eastAsia="Trebuchet MS" w:hAnsi="Trebuchet MS"/>
-          <w:b w:val="0"/>
-          <w:i w:val="0"/>
-          <w:smallCaps w:val="0"/>
-          <w:strike w:val="0"/>
-          <w:color w:val="000000"/>
-          <w:sz w:val="22"/>
-          <w:szCs w:val="22"/>
-          <w:u w:val="none"/>
-          <w:shd w:fill="auto" w:val="clear"/>
-          <w:vertAlign w:val="baseline"/>
-        </w:rPr>
+          <w:rtl w:val="0"/>
+        </w:rPr>
+        <w:t xml:space="preserve">{{ cert.name }} | {{r cert.link }}</w:t>
+        <w:tab/>
+        <w:tab/>
+        <w:t xml:space="preserve">{{ cert.month }} {{ cert.year }}</w:t>
+      </w:r>
+    </w:p>
+    <w:p>
+      <w:pPr>
+        <w:spacing w:line="309.6" w:lineRule="auto"/>
+        <w:ind w:firstLine="720"/>
+        <w:rPr/>
+      </w:pPr>
+      <w:r>
+        <w:rPr>
+          <w:rtl w:val="0"/>
+        </w:rPr>
+        <w:t xml:space="preserve">{{ cert.description }}</w:t>
+      </w:r>
+    </w:p>
+    <w:p>
+      <w:pPr>
+        <w:rPr/>
+      </w:pPr>
+      <w:r>
+        <w:rPr>
+          <w:rtl w:val="0"/>
+        </w:rPr>
+        <w:t xml:space="preserve">{%- endfor %}</w:t>
+      </w:r>
+    </w:p>
+    <w:p>
+      <w:pPr>
+        <w:rPr/>
       </w:pPr>
       <w:r>
         <w:rPr>
@@ -1444,308 +1144,96 @@
     <w:p>
       <w:pPr>
         <w:pStyle w:val="Heading1"/>
-        <w:ind w:left="191" w:firstLine="0"/>
-        <w:rPr/>
-      </w:pPr>
+        <w:spacing w:before="179" w:lineRule="auto"/>
+        <w:ind w:left="0"/>
+        <w:rPr/>
+      </w:pPr>
+      <w:bookmarkStart w:colFirst="0" w:colLast="0" w:name="_jp0j56faodpk" w:id="1"/>
+      <w:bookmarkEnd w:id="1"/>
       <w:r>
         <w:rPr>
           <w:rtl w:val="0"/>
         </w:rPr>
         <w:t xml:space="preserve">EDUCATION</w:t>
       </w:r>
-    </w:p>
-    <w:p>
-      <w:pPr>
-        <w:spacing w:before="153" w:lineRule="auto"/>
-        <w:ind w:left="191" w:right="0" w:firstLine="0"/>
-        <w:jc w:val="left"/>
-        <w:rPr>
-          <w:rFonts w:ascii="Tahoma" w:cs="Tahoma" w:eastAsia="Tahoma" w:hAnsi="Tahoma"/>
-          <w:b w:val="1"/>
-          <w:sz w:val="22"/>
-          <w:szCs w:val="22"/>
-        </w:rPr>
-      </w:pPr>
-      <w:r>
-        <w:br w:type="column"/>
-      </w:r>
-      <w:r>
-        <w:rPr>
-          <w:rFonts w:ascii="Tahoma" w:cs="Tahoma" w:eastAsia="Tahoma" w:hAnsi="Tahoma"/>
-          <w:b w:val="1"/>
-          <w:sz w:val="22"/>
-          <w:szCs w:val="22"/>
-          <w:rtl w:val="0"/>
-        </w:rPr>
-        <w:t xml:space="preserve">Sept 2025</w:t>
-      </w:r>
-    </w:p>
-    <w:p>
-      <w:pPr>
-        <w:keepNext w:val="0"/>
-        <w:keepLines w:val="0"/>
-        <w:pageBreakBefore w:val="0"/>
-        <w:widowControl w:val="0"/>
-        <w:pBdr>
-          <w:top w:space="0" w:sz="0" w:val="nil"/>
-          <w:left w:space="0" w:sz="0" w:val="nil"/>
-          <w:bottom w:space="0" w:sz="0" w:val="nil"/>
-          <w:right w:space="0" w:sz="0" w:val="nil"/>
-          <w:between w:space="0" w:sz="0" w:val="nil"/>
-        </w:pBdr>
-        <w:shd w:fill="auto" w:val="clear"/>
-        <w:spacing w:after="0" w:before="245" w:line="240" w:lineRule="auto"/>
-        <w:ind w:left="0" w:right="0" w:firstLine="0"/>
-        <w:jc w:val="left"/>
-        <w:rPr>
-          <w:rFonts w:ascii="Tahoma" w:cs="Tahoma" w:eastAsia="Tahoma" w:hAnsi="Tahoma"/>
-          <w:b w:val="1"/>
-          <w:i w:val="0"/>
-          <w:smallCaps w:val="0"/>
-          <w:strike w:val="0"/>
-          <w:color w:val="000000"/>
-          <w:sz w:val="22"/>
-          <w:szCs w:val="22"/>
-          <w:u w:val="none"/>
-          <w:shd w:fill="auto" w:val="clear"/>
-          <w:vertAlign w:val="baseline"/>
-        </w:rPr>
-      </w:pPr>
-      <w:r>
-        <w:rPr>
-          <w:rtl w:val="0"/>
-        </w:rPr>
-      </w:r>
-    </w:p>
-    <w:p>
-      <w:pPr>
-        <w:spacing w:before="0" w:lineRule="auto"/>
-        <w:ind w:left="254" w:right="0" w:firstLine="0"/>
-        <w:jc w:val="left"/>
-        <w:rPr>
-          <w:rFonts w:ascii="Tahoma" w:cs="Tahoma" w:eastAsia="Tahoma" w:hAnsi="Tahoma"/>
-          <w:b w:val="1"/>
-          <w:sz w:val="22"/>
-          <w:szCs w:val="22"/>
-        </w:rPr>
-        <w:sectPr>
-          <w:type w:val="continuous"/>
-          <w:pgSz w:h="16850" w:w="11910" w:orient="portrait"/>
-          <w:pgMar w:bottom="280" w:top="180" w:left="566" w:right="566" w:header="360" w:footer="360"/>
-          <w:cols w:equalWidth="0" w:num="2">
-            <w:col w:space="781" w:w="4998.500000000001"/>
-            <w:col w:space="0" w:w="4998.500000000001"/>
-          </w:cols>
-        </w:sectPr>
-      </w:pPr>
-      <w:r>
-        <w:rPr>
-          <w:rFonts w:ascii="Tahoma" w:cs="Tahoma" w:eastAsia="Tahoma" w:hAnsi="Tahoma"/>
-          <w:b w:val="1"/>
-          <w:sz w:val="22"/>
-          <w:szCs w:val="22"/>
-          <w:rtl w:val="0"/>
-        </w:rPr>
-        <w:t xml:space="preserve">Aug 2025</w:t>
-      </w:r>
-    </w:p>
-    <w:p>
-      <w:pPr>
-        <w:keepNext w:val="0"/>
-        <w:keepLines w:val="0"/>
-        <w:pageBreakBefore w:val="0"/>
-        <w:widowControl w:val="0"/>
-        <w:pBdr>
-          <w:top w:space="0" w:sz="0" w:val="nil"/>
-          <w:left w:space="0" w:sz="0" w:val="nil"/>
-          <w:bottom w:space="0" w:sz="0" w:val="nil"/>
-          <w:right w:space="0" w:sz="0" w:val="nil"/>
-          <w:between w:space="0" w:sz="0" w:val="nil"/>
-        </w:pBdr>
-        <w:shd w:fill="auto" w:val="clear"/>
-        <w:spacing w:after="0" w:before="0" w:line="240" w:lineRule="auto"/>
-        <w:ind w:left="0" w:right="0" w:firstLine="0"/>
-        <w:jc w:val="left"/>
-        <w:rPr>
-          <w:rFonts w:ascii="Tahoma" w:cs="Tahoma" w:eastAsia="Tahoma" w:hAnsi="Tahoma"/>
-          <w:b w:val="1"/>
-          <w:i w:val="0"/>
-          <w:smallCaps w:val="0"/>
-          <w:strike w:val="0"/>
-          <w:color w:val="000000"/>
-          <w:sz w:val="5"/>
-          <w:szCs w:val="5"/>
-          <w:u w:val="none"/>
-          <w:shd w:fill="auto" w:val="clear"/>
-          <w:vertAlign w:val="baseline"/>
-        </w:rPr>
-      </w:pPr>
-      <w:r>
-        <w:rPr>
-          <w:rtl w:val="0"/>
-        </w:rPr>
-      </w:r>
-    </w:p>
-    <w:p>
-      <w:pPr>
-        <w:keepNext w:val="0"/>
-        <w:keepLines w:val="0"/>
-        <w:pageBreakBefore w:val="0"/>
-        <w:widowControl w:val="0"/>
-        <w:pBdr>
-          <w:top w:space="0" w:sz="0" w:val="nil"/>
-          <w:left w:space="0" w:sz="0" w:val="nil"/>
-          <w:bottom w:space="0" w:sz="0" w:val="nil"/>
-          <w:right w:space="0" w:sz="0" w:val="nil"/>
-          <w:between w:space="0" w:sz="0" w:val="nil"/>
-        </w:pBdr>
-        <w:shd w:fill="auto" w:val="clear"/>
-        <w:spacing w:after="0" w:before="0" w:line="20" w:lineRule="auto"/>
-        <w:ind w:left="198" w:right="0" w:firstLine="0"/>
-        <w:jc w:val="left"/>
-        <w:rPr>
-          <w:rFonts w:ascii="Tahoma" w:cs="Tahoma" w:eastAsia="Tahoma" w:hAnsi="Tahoma"/>
-          <w:b w:val="0"/>
-          <w:i w:val="0"/>
-          <w:smallCaps w:val="0"/>
-          <w:strike w:val="0"/>
-          <w:color w:val="000000"/>
-          <w:sz w:val="2"/>
-          <w:szCs w:val="2"/>
-          <w:u w:val="none"/>
-          <w:shd w:fill="auto" w:val="clear"/>
-          <w:vertAlign w:val="baseline"/>
-        </w:rPr>
-      </w:pPr>
-      <w:r>
-        <w:rPr>
-          <w:rFonts w:ascii="Tahoma" w:cs="Tahoma" w:eastAsia="Tahoma" w:hAnsi="Tahoma"/>
-          <w:b w:val="0"/>
-          <w:i w:val="0"/>
-          <w:smallCaps w:val="0"/>
-          <w:strike w:val="0"/>
-          <w:color w:val="000000"/>
-          <w:sz w:val="2"/>
-          <w:szCs w:val="2"/>
-          <w:u w:val="none"/>
-          <w:shd w:fill="auto" w:val="clear"/>
-          <w:vertAlign w:val="baseline"/>
-        </w:rPr>
+      <w:r>
         <mc:AlternateContent>
           <mc:Choice Requires="wpg">
             <w:drawing>
-              <wp:inline distB="0" distT="0" distL="0" distR="0">
-                <wp:extent cx="6653530" cy="9525"/>
+              <wp:anchor allowOverlap="1" behindDoc="0" distB="0" distT="0" distL="0" distR="0" hidden="0" layoutInCell="1" locked="0" relativeHeight="0" simplePos="0">
+                <wp:simplePos x="0" y="0"/>
+                <wp:positionH relativeFrom="column">
+                  <wp:posOffset>0</wp:posOffset>
+                </wp:positionH>
+                <wp:positionV relativeFrom="paragraph">
+                  <wp:posOffset>0</wp:posOffset>
+                </wp:positionV>
+                <wp:extent cx="6653530" cy="12700"/>
                 <wp:effectExtent b="0" l="0" r="0" t="0"/>
+                <wp:wrapTopAndBottom distB="0" distT="0"/>
                 <wp:docPr id="3" name=""/>
                 <a:graphic>
-                  <a:graphicData uri="http://schemas.microsoft.com/office/word/2010/wordprocessingGroup">
-                    <wpg:wgp>
-                      <wpg:cNvGrpSpPr/>
-                      <wpg:grpSpPr>
+                  <a:graphicData uri="http://schemas.microsoft.com/office/word/2010/wordprocessingShape">
+                    <wps:wsp>
+                      <wps:cNvSpPr/>
+                      <wps:cNvPr id="5" name="Shape 5"/>
+                      <wps:spPr>
                         <a:xfrm>
-                          <a:off x="2019225" y="3775225"/>
-                          <a:ext cx="6653530" cy="9525"/>
-                          <a:chOff x="2019225" y="3775225"/>
-                          <a:chExt cx="6653550" cy="9550"/>
+                          <a:off x="2019235" y="3779365"/>
+                          <a:ext cx="6653530" cy="1270"/>
                         </a:xfrm>
-                      </wpg:grpSpPr>
-                      <wpg:grpSp>
-                        <wpg:cNvGrpSpPr/>
-                        <wpg:grpSpPr>
-                          <a:xfrm>
-                            <a:off x="2019235" y="3775238"/>
-                            <a:ext cx="6653530" cy="9525"/>
-                            <a:chOff x="0" y="0"/>
-                            <a:chExt cx="6653530" cy="9525"/>
-                          </a:xfrm>
-                        </wpg:grpSpPr>
-                        <wps:wsp>
-                          <wps:cNvSpPr/>
-                          <wps:cNvPr id="3" name="Shape 3"/>
-                          <wps:spPr>
-                            <a:xfrm>
-                              <a:off x="0" y="0"/>
-                              <a:ext cx="6653525" cy="9525"/>
-                            </a:xfrm>
-                            <a:prstGeom prst="rect">
-                              <a:avLst/>
-                            </a:prstGeom>
-                            <a:noFill/>
-                            <a:ln>
-                              <a:noFill/>
-                            </a:ln>
-                          </wps:spPr>
-                          <wps:txbx>
-                            <w:txbxContent>
-                              <w:p>
-                                <w:pPr>
-                                  <w:spacing w:after="0" w:before="0" w:line="240"/>
-                                  <w:ind w:left="0" w:right="0" w:firstLine="0"/>
-                                  <w:jc w:val="left"/>
-                                  <w:textDirection w:val="btLr"/>
-                                </w:pPr>
-                              </w:p>
-                            </w:txbxContent>
-                          </wps:txbx>
-                          <wps:bodyPr anchorCtr="0" anchor="ctr" bIns="91425" lIns="91425" spcFirstLastPara="1" rIns="91425" wrap="square" tIns="91425">
-                            <a:noAutofit/>
-                          </wps:bodyPr>
-                        </wps:wsp>
-                        <wps:wsp>
-                          <wps:cNvSpPr/>
-                          <wps:cNvPr id="7" name="Shape 7"/>
-                          <wps:spPr>
-                            <a:xfrm>
-                              <a:off x="0" y="4764"/>
-                              <a:ext cx="6653530" cy="1270"/>
-                            </a:xfrm>
-                            <a:custGeom>
-                              <a:rect b="b" l="l" r="r" t="t"/>
-                              <a:pathLst>
-                                <a:path extrusionOk="0" h="120000" w="6653530">
-                                  <a:moveTo>
-                                    <a:pt x="0" y="0"/>
-                                  </a:moveTo>
-                                  <a:lnTo>
-                                    <a:pt x="6652981" y="0"/>
-                                  </a:lnTo>
-                                </a:path>
-                              </a:pathLst>
-                            </a:custGeom>
-                            <a:noFill/>
-                            <a:ln cap="flat" cmpd="sng" w="9525">
-                              <a:solidFill>
-                                <a:srgbClr val="1D1D1D"/>
-                              </a:solidFill>
-                              <a:prstDash val="solid"/>
-                              <a:round/>
-                              <a:headEnd len="sm" w="sm" type="none"/>
-                              <a:tailEnd len="sm" w="sm" type="none"/>
-                            </a:ln>
-                          </wps:spPr>
-                          <wps:bodyPr anchorCtr="0" anchor="ctr" bIns="91425" lIns="91425" spcFirstLastPara="1" rIns="91425" wrap="square" tIns="91425">
-                            <a:noAutofit/>
-                          </wps:bodyPr>
-                        </wps:wsp>
-                      </wpg:grpSp>
-                    </wpg:wgp>
+                        <a:custGeom>
+                          <a:rect b="b" l="l" r="r" t="t"/>
+                          <a:pathLst>
+                            <a:path extrusionOk="0" h="120000" w="6653530">
+                              <a:moveTo>
+                                <a:pt x="0" y="0"/>
+                              </a:moveTo>
+                              <a:lnTo>
+                                <a:pt x="6652981" y="0"/>
+                              </a:lnTo>
+                            </a:path>
+                          </a:pathLst>
+                        </a:custGeom>
+                        <a:noFill/>
+                        <a:ln cap="flat" cmpd="sng" w="9525">
+                          <a:solidFill>
+                            <a:srgbClr val="1D1D1D"/>
+                          </a:solidFill>
+                          <a:prstDash val="solid"/>
+                          <a:round/>
+                          <a:headEnd len="sm" w="sm" type="none"/>
+                          <a:tailEnd len="sm" w="sm" type="none"/>
+                        </a:ln>
+                      </wps:spPr>
+                      <wps:bodyPr anchorCtr="0" anchor="ctr" bIns="91425" lIns="91425" spcFirstLastPara="1" rIns="91425" wrap="square" tIns="91425">
+                        <a:noAutofit/>
+                      </wps:bodyPr>
+                    </wps:wsp>
                   </a:graphicData>
                 </a:graphic>
-              </wp:inline>
+              </wp:anchor>
             </w:drawing>
           </mc:Choice>
           <mc:Fallback>
             <w:drawing>
-              <wp:inline distB="0" distT="0" distL="0" distR="0">
-                <wp:extent cx="6653530" cy="9525"/>
+              <wp:anchor allowOverlap="1" behindDoc="0" distB="0" distT="0" distL="0" distR="0" hidden="0" layoutInCell="1" locked="0" relativeHeight="0" simplePos="0">
+                <wp:simplePos x="0" y="0"/>
+                <wp:positionH relativeFrom="column">
+                  <wp:posOffset>0</wp:posOffset>
+                </wp:positionH>
+                <wp:positionV relativeFrom="paragraph">
+                  <wp:posOffset>0</wp:posOffset>
+                </wp:positionV>
+                <wp:extent cx="6653530" cy="12700"/>
                 <wp:effectExtent b="0" l="0" r="0" t="0"/>
-                <wp:docPr id="3" name="image4.png"/>
+                <wp:wrapTopAndBottom distB="0" distT="0"/>
+                <wp:docPr id="3" name="image3.png"/>
                 <a:graphic>
                   <a:graphicData uri="http://schemas.openxmlformats.org/drawingml/2006/picture">
                     <pic:pic>
                       <pic:nvPicPr>
-                        <pic:cNvPr id="0" name="image4.png"/>
+                        <pic:cNvPr id="0" name="image3.png"/>
                         <pic:cNvPicPr preferRelativeResize="0"/>
                       </pic:nvPicPr>
                       <pic:blipFill>
@@ -1758,7 +1246,7 @@
                       <pic:spPr>
                         <a:xfrm>
                           <a:off x="0" y="0"/>
-                          <a:ext cx="6653530" cy="9525"/>
+                          <a:ext cx="6653530" cy="12700"/>
                         </a:xfrm>
                         <a:prstGeom prst="rect"/>
                         <a:ln/>
@@ -1766,503 +1254,101 @@
                     </pic:pic>
                   </a:graphicData>
                 </a:graphic>
-              </wp:inline>
+              </wp:anchor>
             </w:drawing>
           </mc:Fallback>
         </mc:AlternateContent>
       </w:r>
-      <w:r>
-        <w:rPr>
-          <w:rtl w:val="0"/>
-        </w:rPr>
-      </w:r>
-    </w:p>
-    <w:p>
-      <w:pPr>
-        <w:keepNext w:val="0"/>
-        <w:keepLines w:val="0"/>
-        <w:pageBreakBefore w:val="0"/>
-        <w:widowControl w:val="0"/>
-        <w:pBdr>
-          <w:top w:space="0" w:sz="0" w:val="nil"/>
-          <w:left w:space="0" w:sz="0" w:val="nil"/>
-          <w:bottom w:space="0" w:sz="0" w:val="nil"/>
-          <w:right w:space="0" w:sz="0" w:val="nil"/>
-          <w:between w:space="0" w:sz="0" w:val="nil"/>
-        </w:pBdr>
-        <w:shd w:fill="auto" w:val="clear"/>
-        <w:spacing w:after="0" w:before="3" w:line="240" w:lineRule="auto"/>
-        <w:ind w:left="0" w:right="0" w:firstLine="0"/>
-        <w:jc w:val="left"/>
-        <w:rPr>
-          <w:rFonts w:ascii="Tahoma" w:cs="Tahoma" w:eastAsia="Tahoma" w:hAnsi="Tahoma"/>
+    </w:p>
+    <w:p>
+      <w:pPr>
+        <w:rPr/>
+      </w:pPr>
+      <w:r>
+        <w:rPr>
+          <w:rtl w:val="0"/>
+        </w:rPr>
+        <w:t xml:space="preserve">{% for edu in educations %}</w:t>
+      </w:r>
+    </w:p>
+    <w:p>
+      <w:pPr>
+        <w:rPr>
           <w:b w:val="1"/>
-          <w:i w:val="0"/>
-          <w:smallCaps w:val="0"/>
-          <w:strike w:val="0"/>
-          <w:color w:val="000000"/>
-          <w:sz w:val="7"/>
-          <w:szCs w:val="7"/>
-          <w:u w:val="none"/>
-          <w:shd w:fill="auto" w:val="clear"/>
-          <w:vertAlign w:val="baseline"/>
-        </w:rPr>
-        <w:sectPr>
-          <w:type w:val="continuous"/>
-          <w:pgSz w:h="16850" w:w="11910" w:orient="portrait"/>
-          <w:pgMar w:bottom="280" w:top="180" w:left="566" w:right="566" w:header="360" w:footer="360"/>
-        </w:sectPr>
-      </w:pPr>
-      <w:r>
-        <w:rPr>
-          <w:rtl w:val="0"/>
-        </w:rPr>
-      </w:r>
-    </w:p>
-    <w:p>
-      <w:pPr>
-        <w:spacing w:before="93" w:lineRule="auto"/>
-        <w:ind w:left="150" w:right="0" w:firstLine="0"/>
-        <w:jc w:val="left"/>
-        <w:rPr>
-          <w:rFonts w:ascii="Tahoma" w:cs="Tahoma" w:eastAsia="Tahoma" w:hAnsi="Tahoma"/>
+        </w:rPr>
+      </w:pPr>
+      <w:r>
+        <w:rPr>
           <w:b w:val="1"/>
-          <w:sz w:val="22"/>
-          <w:szCs w:val="22"/>
-        </w:rPr>
-      </w:pPr>
-      <w:r>
-        <w:rPr>
-          <w:rFonts w:ascii="Tahoma" w:cs="Tahoma" w:eastAsia="Tahoma" w:hAnsi="Tahoma"/>
+          <w:rtl w:val="0"/>
+        </w:rPr>
+        <w:t xml:space="preserve">{{ edu.degree }} - Marks: {{ edu.score }}</w:t>
+      </w:r>
+      <w:r>
+        <w:rPr>
+          <w:rtl w:val="0"/>
+        </w:rPr>
+        <w:tab/>
+        <w:tab/>
+      </w:r>
+      <w:r>
+        <w:rPr>
+          <w:rtl w:val="0"/>
+        </w:rPr>
+        <w:t xml:space="preserve">{% if edu.start_month %}</w:t>
+      </w:r>
+      <w:r>
+        <w:rPr>
           <w:b w:val="1"/>
-          <w:sz w:val="22"/>
-          <w:szCs w:val="22"/>
-          <w:rtl w:val="0"/>
-        </w:rPr>
-        <w:t xml:space="preserve">Bachelor of Science in IT - Marks: 8.1 CGPA</w:t>
-      </w:r>
-    </w:p>
-    <w:p>
-      <w:pPr>
-        <w:keepNext w:val="0"/>
-        <w:keepLines w:val="0"/>
-        <w:pageBreakBefore w:val="0"/>
-        <w:widowControl w:val="0"/>
-        <w:pBdr>
-          <w:top w:space="0" w:sz="0" w:val="nil"/>
-          <w:left w:space="0" w:sz="0" w:val="nil"/>
-          <w:bottom w:space="0" w:sz="0" w:val="nil"/>
-          <w:right w:space="0" w:sz="0" w:val="nil"/>
-          <w:between w:space="0" w:sz="0" w:val="nil"/>
-        </w:pBdr>
-        <w:shd w:fill="auto" w:val="clear"/>
-        <w:spacing w:after="0" w:before="124" w:line="240" w:lineRule="auto"/>
-        <w:ind w:left="150" w:right="0" w:firstLine="0"/>
-        <w:jc w:val="left"/>
-        <w:rPr>
-          <w:rFonts w:ascii="Trebuchet MS" w:cs="Trebuchet MS" w:eastAsia="Trebuchet MS" w:hAnsi="Trebuchet MS"/>
-          <w:b w:val="0"/>
-          <w:i w:val="0"/>
-          <w:smallCaps w:val="0"/>
-          <w:strike w:val="0"/>
-          <w:color w:val="000000"/>
-          <w:sz w:val="22"/>
-          <w:szCs w:val="22"/>
-          <w:u w:val="none"/>
-          <w:shd w:fill="auto" w:val="clear"/>
-          <w:vertAlign w:val="baseline"/>
-        </w:rPr>
-      </w:pPr>
-      <w:r>
-        <w:rPr>
-          <w:rFonts w:ascii="Trebuchet MS" w:cs="Trebuchet MS" w:eastAsia="Trebuchet MS" w:hAnsi="Trebuchet MS"/>
-          <w:b w:val="0"/>
-          <w:i w:val="0"/>
-          <w:smallCaps w:val="0"/>
-          <w:strike w:val="0"/>
-          <w:color w:val="000000"/>
-          <w:sz w:val="22"/>
-          <w:szCs w:val="22"/>
-          <w:u w:val="none"/>
-          <w:shd w:fill="auto" w:val="clear"/>
-          <w:vertAlign w:val="baseline"/>
-          <w:rtl w:val="0"/>
-        </w:rPr>
-        <w:t xml:space="preserve">Thakur College of Science &amp; Commerce, Kandivali (E), Mumbai - 400101</w:t>
-      </w:r>
-    </w:p>
-    <w:p>
-      <w:pPr>
-        <w:spacing w:before="213" w:lineRule="auto"/>
-        <w:ind w:left="150" w:right="0" w:firstLine="0"/>
-        <w:jc w:val="left"/>
-        <w:rPr>
-          <w:rFonts w:ascii="Tahoma" w:cs="Tahoma" w:eastAsia="Tahoma" w:hAnsi="Tahoma"/>
+          <w:rtl w:val="0"/>
+        </w:rPr>
+        <w:t xml:space="preserve">{{ edu.start_month }} {{ edu.start_year }} -</w:t>
+      </w:r>
+      <w:r>
+        <w:rPr>
+          <w:rtl w:val="0"/>
+        </w:rPr>
+        <w:t xml:space="preserve"> {% endif %}</w:t>
+      </w:r>
+      <w:r>
+        <w:rPr>
           <w:b w:val="1"/>
-          <w:sz w:val="22"/>
-          <w:szCs w:val="22"/>
-        </w:rPr>
-      </w:pPr>
-      <w:r>
-        <w:rPr>
-          <w:rFonts w:ascii="Tahoma" w:cs="Tahoma" w:eastAsia="Tahoma" w:hAnsi="Tahoma"/>
-          <w:b w:val="1"/>
-          <w:sz w:val="22"/>
-          <w:szCs w:val="22"/>
-          <w:rtl w:val="0"/>
-        </w:rPr>
-        <w:t xml:space="preserve">HSC Science - Marks: 80%</w:t>
-      </w:r>
-    </w:p>
-    <w:p>
-      <w:pPr>
-        <w:keepNext w:val="0"/>
-        <w:keepLines w:val="0"/>
-        <w:pageBreakBefore w:val="0"/>
-        <w:widowControl w:val="0"/>
-        <w:pBdr>
-          <w:top w:space="0" w:sz="0" w:val="nil"/>
-          <w:left w:space="0" w:sz="0" w:val="nil"/>
-          <w:bottom w:space="0" w:sz="0" w:val="nil"/>
-          <w:right w:space="0" w:sz="0" w:val="nil"/>
-          <w:between w:space="0" w:sz="0" w:val="nil"/>
-        </w:pBdr>
-        <w:shd w:fill="auto" w:val="clear"/>
-        <w:spacing w:after="0" w:before="124" w:line="240" w:lineRule="auto"/>
-        <w:ind w:left="150" w:right="0" w:firstLine="0"/>
-        <w:jc w:val="left"/>
-        <w:rPr>
-          <w:rFonts w:ascii="Trebuchet MS" w:cs="Trebuchet MS" w:eastAsia="Trebuchet MS" w:hAnsi="Trebuchet MS"/>
-          <w:b w:val="0"/>
-          <w:i w:val="0"/>
-          <w:smallCaps w:val="0"/>
-          <w:strike w:val="0"/>
-          <w:color w:val="000000"/>
-          <w:sz w:val="22"/>
-          <w:szCs w:val="22"/>
-          <w:u w:val="none"/>
-          <w:shd w:fill="auto" w:val="clear"/>
-          <w:vertAlign w:val="baseline"/>
-        </w:rPr>
-      </w:pPr>
-      <w:r>
-        <w:rPr>
-          <w:rFonts w:ascii="Trebuchet MS" w:cs="Trebuchet MS" w:eastAsia="Trebuchet MS" w:hAnsi="Trebuchet MS"/>
-          <w:b w:val="0"/>
-          <w:i w:val="0"/>
-          <w:smallCaps w:val="0"/>
-          <w:strike w:val="0"/>
-          <w:color w:val="000000"/>
-          <w:sz w:val="22"/>
-          <w:szCs w:val="22"/>
-          <w:u w:val="none"/>
-          <w:shd w:fill="auto" w:val="clear"/>
-          <w:vertAlign w:val="baseline"/>
-          <w:rtl w:val="0"/>
-        </w:rPr>
-        <w:t xml:space="preserve">Thakur College of Science &amp; Commerce, Kandivali (E), Mumbai - 400101</w:t>
-      </w:r>
-    </w:p>
-    <w:p>
-      <w:pPr>
-        <w:spacing w:before="212" w:lineRule="auto"/>
-        <w:ind w:left="150" w:right="0" w:firstLine="0"/>
-        <w:jc w:val="left"/>
-        <w:rPr>
-          <w:rFonts w:ascii="Tahoma" w:cs="Tahoma" w:eastAsia="Tahoma" w:hAnsi="Tahoma"/>
-          <w:b w:val="1"/>
-          <w:sz w:val="22"/>
-          <w:szCs w:val="22"/>
-        </w:rPr>
-      </w:pPr>
-      <w:r>
-        <w:rPr>
-          <w:rFonts w:ascii="Tahoma" w:cs="Tahoma" w:eastAsia="Tahoma" w:hAnsi="Tahoma"/>
-          <w:b w:val="1"/>
-          <w:sz w:val="22"/>
-          <w:szCs w:val="22"/>
-          <w:rtl w:val="0"/>
-        </w:rPr>
-        <w:t xml:space="preserve">SSC - Marks: 77.8%</w:t>
-      </w:r>
-    </w:p>
-    <w:p>
-      <w:pPr>
-        <w:keepNext w:val="0"/>
-        <w:keepLines w:val="0"/>
-        <w:pageBreakBefore w:val="0"/>
-        <w:widowControl w:val="0"/>
-        <w:pBdr>
-          <w:top w:space="0" w:sz="0" w:val="nil"/>
-          <w:left w:space="0" w:sz="0" w:val="nil"/>
-          <w:bottom w:space="0" w:sz="0" w:val="nil"/>
-          <w:right w:space="0" w:sz="0" w:val="nil"/>
-          <w:between w:space="0" w:sz="0" w:val="nil"/>
-        </w:pBdr>
-        <w:shd w:fill="auto" w:val="clear"/>
-        <w:spacing w:after="0" w:before="124" w:line="240" w:lineRule="auto"/>
-        <w:ind w:left="160" w:right="0" w:firstLine="0"/>
-        <w:jc w:val="left"/>
-        <w:rPr>
-          <w:rFonts w:ascii="Trebuchet MS" w:cs="Trebuchet MS" w:eastAsia="Trebuchet MS" w:hAnsi="Trebuchet MS"/>
-          <w:b w:val="0"/>
-          <w:i w:val="0"/>
-          <w:smallCaps w:val="0"/>
-          <w:strike w:val="0"/>
-          <w:color w:val="000000"/>
-          <w:sz w:val="22"/>
-          <w:szCs w:val="22"/>
-          <w:u w:val="none"/>
-          <w:shd w:fill="auto" w:val="clear"/>
-          <w:vertAlign w:val="baseline"/>
-        </w:rPr>
-      </w:pPr>
-      <w:r>
-        <w:rPr>
-          <w:rFonts w:ascii="Trebuchet MS" w:cs="Trebuchet MS" w:eastAsia="Trebuchet MS" w:hAnsi="Trebuchet MS"/>
-          <w:b w:val="0"/>
-          <w:i w:val="0"/>
-          <w:smallCaps w:val="0"/>
-          <w:strike w:val="0"/>
-          <w:color w:val="000000"/>
-          <w:sz w:val="22"/>
-          <w:szCs w:val="22"/>
-          <w:u w:val="none"/>
-          <w:shd w:fill="auto" w:val="clear"/>
-          <w:vertAlign w:val="baseline"/>
-          <w:rtl w:val="0"/>
-        </w:rPr>
-        <w:t xml:space="preserve">St. Joseph English School, Nandakhal, Virar (W) - 401303</w:t>
-      </w:r>
-    </w:p>
-    <w:p>
-      <w:pPr>
-        <w:spacing w:before="93" w:lineRule="auto"/>
-        <w:ind w:left="0" w:right="121" w:firstLine="0"/>
-        <w:jc w:val="right"/>
-        <w:rPr>
-          <w:rFonts w:ascii="Tahoma" w:cs="Tahoma" w:eastAsia="Tahoma" w:hAnsi="Tahoma"/>
-          <w:b w:val="1"/>
-          <w:sz w:val="22"/>
-          <w:szCs w:val="22"/>
-        </w:rPr>
-      </w:pPr>
-      <w:r>
-        <w:br w:type="column"/>
-      </w:r>
-      <w:r>
-        <w:rPr>
-          <w:rFonts w:ascii="Tahoma" w:cs="Tahoma" w:eastAsia="Tahoma" w:hAnsi="Tahoma"/>
-          <w:b w:val="1"/>
-          <w:sz w:val="22"/>
-          <w:szCs w:val="22"/>
-          <w:rtl w:val="0"/>
-        </w:rPr>
-        <w:t xml:space="preserve">Apr 2021 - Apr 2025</w:t>
-      </w:r>
-    </w:p>
-    <w:p>
-      <w:pPr>
-        <w:keepNext w:val="0"/>
-        <w:keepLines w:val="0"/>
-        <w:pageBreakBefore w:val="0"/>
-        <w:widowControl w:val="0"/>
-        <w:pBdr>
-          <w:top w:space="0" w:sz="0" w:val="nil"/>
-          <w:left w:space="0" w:sz="0" w:val="nil"/>
-          <w:bottom w:space="0" w:sz="0" w:val="nil"/>
-          <w:right w:space="0" w:sz="0" w:val="nil"/>
-          <w:between w:space="0" w:sz="0" w:val="nil"/>
-        </w:pBdr>
-        <w:shd w:fill="auto" w:val="clear"/>
-        <w:spacing w:after="0" w:before="0" w:line="240" w:lineRule="auto"/>
-        <w:ind w:left="0" w:right="0" w:firstLine="0"/>
-        <w:jc w:val="left"/>
-        <w:rPr>
-          <w:rFonts w:ascii="Tahoma" w:cs="Tahoma" w:eastAsia="Tahoma" w:hAnsi="Tahoma"/>
-          <w:b w:val="1"/>
-          <w:i w:val="0"/>
-          <w:smallCaps w:val="0"/>
-          <w:strike w:val="0"/>
-          <w:color w:val="000000"/>
-          <w:sz w:val="22"/>
-          <w:szCs w:val="22"/>
-          <w:u w:val="none"/>
-          <w:shd w:fill="auto" w:val="clear"/>
-          <w:vertAlign w:val="baseline"/>
-        </w:rPr>
-      </w:pPr>
-      <w:r>
-        <w:rPr>
-          <w:rtl w:val="0"/>
-        </w:rPr>
-      </w:r>
-    </w:p>
-    <w:p>
-      <w:pPr>
-        <w:keepNext w:val="0"/>
-        <w:keepLines w:val="0"/>
-        <w:pageBreakBefore w:val="0"/>
-        <w:widowControl w:val="0"/>
-        <w:pBdr>
-          <w:top w:space="0" w:sz="0" w:val="nil"/>
-          <w:left w:space="0" w:sz="0" w:val="nil"/>
-          <w:bottom w:space="0" w:sz="0" w:val="nil"/>
-          <w:right w:space="0" w:sz="0" w:val="nil"/>
-          <w:between w:space="0" w:sz="0" w:val="nil"/>
-        </w:pBdr>
-        <w:shd w:fill="auto" w:val="clear"/>
-        <w:spacing w:after="0" w:before="61" w:line="240" w:lineRule="auto"/>
-        <w:ind w:left="0" w:right="0" w:firstLine="0"/>
-        <w:jc w:val="left"/>
-        <w:rPr>
-          <w:rFonts w:ascii="Tahoma" w:cs="Tahoma" w:eastAsia="Tahoma" w:hAnsi="Tahoma"/>
-          <w:b w:val="1"/>
-          <w:i w:val="0"/>
-          <w:smallCaps w:val="0"/>
-          <w:strike w:val="0"/>
-          <w:color w:val="000000"/>
-          <w:sz w:val="22"/>
-          <w:szCs w:val="22"/>
-          <w:u w:val="none"/>
-          <w:shd w:fill="auto" w:val="clear"/>
-          <w:vertAlign w:val="baseline"/>
-        </w:rPr>
-      </w:pPr>
-      <w:r>
-        <w:rPr>
-          <w:rtl w:val="0"/>
-        </w:rPr>
-      </w:r>
-    </w:p>
-    <w:p>
-      <w:pPr>
-        <w:spacing w:before="0" w:lineRule="auto"/>
-        <w:ind w:left="0" w:right="121" w:firstLine="0"/>
-        <w:jc w:val="right"/>
-        <w:rPr>
-          <w:rFonts w:ascii="Tahoma" w:cs="Tahoma" w:eastAsia="Tahoma" w:hAnsi="Tahoma"/>
-          <w:b w:val="1"/>
-          <w:sz w:val="22"/>
-          <w:szCs w:val="22"/>
-        </w:rPr>
-      </w:pPr>
-      <w:r>
-        <w:rPr>
-          <w:rFonts w:ascii="Tahoma" w:cs="Tahoma" w:eastAsia="Tahoma" w:hAnsi="Tahoma"/>
-          <w:b w:val="1"/>
-          <w:sz w:val="22"/>
-          <w:szCs w:val="22"/>
-          <w:rtl w:val="0"/>
-        </w:rPr>
-        <w:t xml:space="preserve">May 2021</w:t>
-      </w:r>
-    </w:p>
-    <w:p>
-      <w:pPr>
-        <w:keepNext w:val="0"/>
-        <w:keepLines w:val="0"/>
-        <w:pageBreakBefore w:val="0"/>
-        <w:widowControl w:val="0"/>
-        <w:pBdr>
-          <w:top w:space="0" w:sz="0" w:val="nil"/>
-          <w:left w:space="0" w:sz="0" w:val="nil"/>
-          <w:bottom w:space="0" w:sz="0" w:val="nil"/>
-          <w:right w:space="0" w:sz="0" w:val="nil"/>
-          <w:between w:space="0" w:sz="0" w:val="nil"/>
-        </w:pBdr>
-        <w:shd w:fill="auto" w:val="clear"/>
-        <w:spacing w:after="0" w:before="0" w:line="240" w:lineRule="auto"/>
-        <w:ind w:left="0" w:right="0" w:firstLine="0"/>
-        <w:jc w:val="left"/>
-        <w:rPr>
-          <w:rFonts w:ascii="Tahoma" w:cs="Tahoma" w:eastAsia="Tahoma" w:hAnsi="Tahoma"/>
-          <w:b w:val="1"/>
-          <w:i w:val="0"/>
-          <w:smallCaps w:val="0"/>
-          <w:strike w:val="0"/>
-          <w:color w:val="000000"/>
-          <w:sz w:val="22"/>
-          <w:szCs w:val="22"/>
-          <w:u w:val="none"/>
-          <w:shd w:fill="auto" w:val="clear"/>
-          <w:vertAlign w:val="baseline"/>
-        </w:rPr>
-      </w:pPr>
-      <w:r>
-        <w:rPr>
-          <w:rtl w:val="0"/>
-        </w:rPr>
-      </w:r>
-    </w:p>
-    <w:p>
-      <w:pPr>
-        <w:keepNext w:val="0"/>
-        <w:keepLines w:val="0"/>
-        <w:pageBreakBefore w:val="0"/>
-        <w:widowControl w:val="0"/>
-        <w:pBdr>
-          <w:top w:space="0" w:sz="0" w:val="nil"/>
-          <w:left w:space="0" w:sz="0" w:val="nil"/>
-          <w:bottom w:space="0" w:sz="0" w:val="nil"/>
-          <w:right w:space="0" w:sz="0" w:val="nil"/>
-          <w:between w:space="0" w:sz="0" w:val="nil"/>
-        </w:pBdr>
-        <w:shd w:fill="auto" w:val="clear"/>
-        <w:spacing w:after="0" w:before="60" w:line="240" w:lineRule="auto"/>
-        <w:ind w:left="0" w:right="0" w:firstLine="0"/>
-        <w:jc w:val="left"/>
-        <w:rPr>
-          <w:rFonts w:ascii="Tahoma" w:cs="Tahoma" w:eastAsia="Tahoma" w:hAnsi="Tahoma"/>
-          <w:b w:val="1"/>
-          <w:i w:val="0"/>
-          <w:smallCaps w:val="0"/>
-          <w:strike w:val="0"/>
-          <w:color w:val="000000"/>
-          <w:sz w:val="22"/>
-          <w:szCs w:val="22"/>
-          <w:u w:val="none"/>
-          <w:shd w:fill="auto" w:val="clear"/>
-          <w:vertAlign w:val="baseline"/>
-        </w:rPr>
-      </w:pPr>
-      <w:r>
-        <w:rPr>
-          <w:rtl w:val="0"/>
-        </w:rPr>
-      </w:r>
-    </w:p>
-    <w:p>
-      <w:pPr>
-        <w:spacing w:before="1" w:lineRule="auto"/>
-        <w:ind w:left="0" w:right="111" w:firstLine="0"/>
-        <w:jc w:val="right"/>
-        <w:rPr>
-          <w:rFonts w:ascii="Tahoma" w:cs="Tahoma" w:eastAsia="Tahoma" w:hAnsi="Tahoma"/>
-          <w:b w:val="1"/>
-          <w:sz w:val="22"/>
-          <w:szCs w:val="22"/>
-        </w:rPr>
-      </w:pPr>
-      <w:r>
-        <w:rPr>
-          <w:rFonts w:ascii="Tahoma" w:cs="Tahoma" w:eastAsia="Tahoma" w:hAnsi="Tahoma"/>
-          <w:b w:val="1"/>
-          <w:sz w:val="22"/>
-          <w:szCs w:val="22"/>
-          <w:rtl w:val="0"/>
-        </w:rPr>
-        <w:t xml:space="preserve">March - 2019</w:t>
+          <w:rtl w:val="0"/>
+        </w:rPr>
+        <w:t xml:space="preserve">{{ edu.end_month }} {{ edu.end_year }}</w:t>
+      </w:r>
+    </w:p>
+    <w:p>
+      <w:pPr>
+        <w:rPr/>
+      </w:pPr>
+      <w:r>
+        <w:rPr>
+          <w:rtl w:val="0"/>
+        </w:rPr>
+        <w:t xml:space="preserve">{{ edu.institution }}</w:t>
+      </w:r>
+    </w:p>
+    <w:p>
+      <w:pPr>
+        <w:rPr/>
+      </w:pPr>
+      <w:r>
+        <w:rPr>
+          <w:rtl w:val="0"/>
+        </w:rPr>
+        <w:t xml:space="preserve">{% endfor %}</w:t>
+      </w:r>
+      <w:r>
+        <w:rPr>
+          <w:rtl w:val="0"/>
+        </w:rPr>
       </w:r>
     </w:p>
     <w:sectPr>
-      <w:type w:val="continuous"/>
       <w:pgSz w:h="16850" w:w="11910" w:orient="portrait"/>
       <w:pgMar w:bottom="280" w:top="180" w:left="566" w:right="566" w:header="360" w:footer="360"/>
-      <w:cols w:equalWidth="0" w:num="2">
-        <w:col w:space="667" w:w="5055.500000000001"/>
-        <w:col w:space="0" w:w="5055.500000000001"/>
-      </w:cols>
+      <w:pgNumType w:start="1"/>
     </w:sectPr>
   </w:body>
 </w:document>
@@ -2600,6 +1686,116 @@
       </w:rPr>
     </w:lvl>
   </w:abstractNum>
+  <w:abstractNum w:abstractNumId="4">
+    <w:lvl w:ilvl="0">
+      <w:start w:val="1"/>
+      <w:numFmt w:val="bullet"/>
+      <w:lvlText w:val="●"/>
+      <w:lvlJc w:val="left"/>
+      <w:pPr>
+        <w:ind w:left="720" w:hanging="360"/>
+      </w:pPr>
+      <w:rPr>
+        <w:u w:val="none"/>
+      </w:rPr>
+    </w:lvl>
+    <w:lvl w:ilvl="1">
+      <w:start w:val="1"/>
+      <w:numFmt w:val="bullet"/>
+      <w:lvlText w:val="○"/>
+      <w:lvlJc w:val="left"/>
+      <w:pPr>
+        <w:ind w:left="1440" w:hanging="360"/>
+      </w:pPr>
+      <w:rPr>
+        <w:u w:val="none"/>
+      </w:rPr>
+    </w:lvl>
+    <w:lvl w:ilvl="2">
+      <w:start w:val="1"/>
+      <w:numFmt w:val="bullet"/>
+      <w:lvlText w:val="■"/>
+      <w:lvlJc w:val="left"/>
+      <w:pPr>
+        <w:ind w:left="2160" w:hanging="360"/>
+      </w:pPr>
+      <w:rPr>
+        <w:u w:val="none"/>
+      </w:rPr>
+    </w:lvl>
+    <w:lvl w:ilvl="3">
+      <w:start w:val="1"/>
+      <w:numFmt w:val="bullet"/>
+      <w:lvlText w:val="●"/>
+      <w:lvlJc w:val="left"/>
+      <w:pPr>
+        <w:ind w:left="2880" w:hanging="360"/>
+      </w:pPr>
+      <w:rPr>
+        <w:u w:val="none"/>
+      </w:rPr>
+    </w:lvl>
+    <w:lvl w:ilvl="4">
+      <w:start w:val="1"/>
+      <w:numFmt w:val="bullet"/>
+      <w:lvlText w:val="○"/>
+      <w:lvlJc w:val="left"/>
+      <w:pPr>
+        <w:ind w:left="3600" w:hanging="360"/>
+      </w:pPr>
+      <w:rPr>
+        <w:u w:val="none"/>
+      </w:rPr>
+    </w:lvl>
+    <w:lvl w:ilvl="5">
+      <w:start w:val="1"/>
+      <w:numFmt w:val="bullet"/>
+      <w:lvlText w:val="■"/>
+      <w:lvlJc w:val="left"/>
+      <w:pPr>
+        <w:ind w:left="4320" w:hanging="360"/>
+      </w:pPr>
+      <w:rPr>
+        <w:u w:val="none"/>
+      </w:rPr>
+    </w:lvl>
+    <w:lvl w:ilvl="6">
+      <w:start w:val="1"/>
+      <w:numFmt w:val="bullet"/>
+      <w:lvlText w:val="●"/>
+      <w:lvlJc w:val="left"/>
+      <w:pPr>
+        <w:ind w:left="5040" w:hanging="360"/>
+      </w:pPr>
+      <w:rPr>
+        <w:u w:val="none"/>
+      </w:rPr>
+    </w:lvl>
+    <w:lvl w:ilvl="7">
+      <w:start w:val="1"/>
+      <w:numFmt w:val="bullet"/>
+      <w:lvlText w:val="○"/>
+      <w:lvlJc w:val="left"/>
+      <w:pPr>
+        <w:ind w:left="5760" w:hanging="360"/>
+      </w:pPr>
+      <w:rPr>
+        <w:u w:val="none"/>
+      </w:rPr>
+    </w:lvl>
+    <w:lvl w:ilvl="8">
+      <w:start w:val="1"/>
+      <w:numFmt w:val="bullet"/>
+      <w:lvlText w:val="■"/>
+      <w:lvlJc w:val="left"/>
+      <w:pPr>
+        <w:ind w:left="6480" w:hanging="360"/>
+      </w:pPr>
+      <w:rPr>
+        <w:u w:val="none"/>
+      </w:rPr>
+    </w:lvl>
+  </w:abstractNum>
   <w:num w:numId="1">
     <w:abstractNumId w:val="1"/>
   </w:num>
@@ -2608,6 +1804,9 @@
   </w:num>
   <w:num w:numId="3">
     <w:abstractNumId w:val="3"/>
+  </w:num>
+  <w:num w:numId="4">
+    <w:abstractNumId w:val="4"/>
   </w:num>
 </w:numbering>
 </file>

</xml_diff>